<commit_message>
Add the GitHub URL to the report and update the README.md file to have the GitHub workflow
</commit_message>
<xml_diff>
--- a/module_summary.docx
+++ b/module_summary.docx
@@ -57,6 +57,12 @@
       </w:pPr>
       <w:r>
         <w:t>This project builds a complete, reproducible data workflow for the New York City Airbnb Open Data set, available at https://www.kaggle.com/datasets/dgomonov/new-york-city-airbnb-open-data. The workflow loads, cleans, explores, and visualizes the data using Python, Pandas, and Seaborn. The main goal was to find pricing patterns across boroughs and room types, and to check whether listing price relates to review activity.</w:t>
+      </w:r>
+      <w:r>
+        <w:t xml:space="preserve"> The project’s GitHub repo: </w:t>
+      </w:r>
+      <w:r>
+        <w:t>https://github.com/bnwiran/ai-programming-foundations-project</w:t>
       </w:r>
     </w:p>
     <w:p>
@@ -548,6 +554,9 @@
         <w:jc w:val="center"/>
       </w:pPr>
       <w:r>
+        <w:rPr>
+          <w:noProof/>
+        </w:rPr>
         <w:lastRenderedPageBreak/>
         <w:drawing>
           <wp:inline distT="0" distB="0" distL="0" distR="0" wp14:anchorId="240D4E92" wp14:editId="2D12D1BE">

</xml_diff>